<commit_message>
feat(grievance): adopt official خطاب تظلم template with exact in-place field replacements
</commit_message>
<xml_diff>
--- a/frontend/public/templates/grievance_letter_template.docx
+++ b/frontend/public/templates/grievance_letter_template.docx
@@ -35,46 +35,7 @@
           <w:rtl/>
           <w:lang w:bidi="ar-EG"/>
         </w:rPr>
-        <w:t>خط</w:t>
-      </w:r>
-      <w:r>
-        <w:rPr>
-          <w:rFonts w:cs="PT Bold Heading" w:hint="cs"/>
-          <w:b/>
-          <w:bCs/>
-          <w:sz w:val="44"/>
-          <w:szCs w:val="46"/>
-          <w:u w:val="single"/>
-          <w:rtl/>
-          <w:lang w:bidi="ar-EG"/>
-        </w:rPr>
-        <w:t>ا</w:t>
-      </w:r>
-      <w:r>
-        <w:rPr>
-          <w:rFonts w:cs="PT Bold Heading" w:hint="cs"/>
-          <w:b/>
-          <w:bCs/>
-          <w:sz w:val="44"/>
-          <w:szCs w:val="46"/>
-          <w:u w:val="single"/>
-          <w:rtl/>
-          <w:lang w:bidi="ar-EG"/>
-        </w:rPr>
-        <w:t>ب ت</w:t>
-      </w:r>
-      <w:r>
-        <w:rPr>
-          <w:rFonts w:cs="PT Bold Heading" w:hint="cs"/>
-          <w:b/>
-          <w:bCs/>
-          <w:sz w:val="44"/>
-          <w:szCs w:val="46"/>
-          <w:u w:val="single"/>
-          <w:rtl/>
-          <w:lang w:bidi="ar-EG"/>
-        </w:rPr>
-        <w:t xml:space="preserve">ظلم  </w:t>
+        <w:t xml:space="preserve">خطاب تظلم  </w:t>
       </w:r>
       <w:r>
         <w:rPr>
@@ -98,31 +59,7 @@
           <w:rtl/>
           <w:lang w:bidi="ar-EG"/>
         </w:rPr>
-        <w:t xml:space="preserve">     </w:t>
-      </w:r>
-      <w:r>
-        <w:rPr>
-          <w:rFonts w:asciiTheme="majorHAnsi" w:hAnsiTheme="majorHAnsi" w:cstheme="minorHAnsi" w:hint="cs"/>
-          <w:b/>
-          <w:bCs/>
-          <w:sz w:val="28"/>
-          <w:szCs w:val="28"/>
-          <w:rtl/>
-          <w:lang w:bidi="ar-EG"/>
-        </w:rPr>
-        <w:t xml:space="preserve">           </w:t>
-      </w:r>
-      <w:r>
-        <w:rPr>
-          <w:rFonts w:asciiTheme="majorHAnsi" w:hAnsiTheme="majorHAnsi" w:cstheme="minorHAnsi" w:hint="cs"/>
-          <w:b/>
-          <w:bCs/>
-          <w:sz w:val="28"/>
-          <w:szCs w:val="28"/>
-          <w:rtl/>
-          <w:lang w:bidi="ar-EG"/>
-        </w:rPr>
-        <w:t xml:space="preserve">      </w:t>
+        <w:t xml:space="preserve">                      </w:t>
       </w:r>
       <w:r>
         <w:rPr>
@@ -431,18 +368,7 @@
           <w:rtl/>
           <w:lang w:bidi="ar-EG"/>
         </w:rPr>
-        <w:t xml:space="preserve"> </w:t>
-      </w:r>
-      <w:r>
-        <w:rPr>
-          <w:b/>
-          <w:bCs/>
-          <w:sz w:val="28"/>
-          <w:szCs w:val="28"/>
-          <w:rtl/>
-          <w:lang w:bidi="ar-EG"/>
-        </w:rPr>
-        <w:t xml:space="preserve">والخاصة </w:t>
+        <w:t xml:space="preserve"> والخاصة </w:t>
       </w:r>
       <w:r>
         <w:rPr>
@@ -599,55 +525,7 @@
           <w:rtl/>
           <w:lang w:bidi="ar-EG"/>
         </w:rPr>
-        <w:t xml:space="preserve"> </w:t>
-      </w:r>
-      <w:r>
-        <w:rPr>
-          <w:rFonts w:hint="cs"/>
-          <w:b/>
-          <w:bCs/>
-          <w:sz w:val="28"/>
-          <w:szCs w:val="28"/>
-          <w:rtl/>
-          <w:lang w:bidi="ar-EG"/>
-        </w:rPr>
-        <w:t>و</w:t>
-      </w:r>
-      <w:r>
-        <w:rPr>
-          <w:rFonts w:hint="cs"/>
-          <w:b/>
-          <w:bCs/>
-          <w:sz w:val="28"/>
-          <w:szCs w:val="28"/>
-          <w:rtl/>
-          <w:lang w:bidi="ar-EG"/>
-        </w:rPr>
-        <w:t xml:space="preserve">إعمالا لأحكام القانون  رقم 182 لسنة 2018 ولائحته التنفيذيه بشأن تنظيم التعاقدات التي تبرمها الجهات العامه وبالإشارة </w:t>
-      </w:r>
-      <w:r>
-        <w:rPr>
-          <w:rFonts w:hint="cs"/>
-          <w:b/>
-          <w:bCs/>
-          <w:sz w:val="28"/>
-          <w:szCs w:val="28"/>
-          <w:rtl/>
-          <w:lang w:bidi="ar-EG"/>
-        </w:rPr>
-        <w:t>إ</w:t>
-      </w:r>
-      <w:r>
-        <w:rPr>
-          <w:rFonts w:hint="cs"/>
-          <w:b/>
-          <w:bCs/>
-          <w:sz w:val="28"/>
-          <w:szCs w:val="28"/>
-          <w:rtl/>
-          <w:lang w:bidi="ar-EG"/>
-        </w:rPr>
-        <w:t xml:space="preserve">لى كراسة الشروط والمواصفات الخاصه بالعمليه المذكوره أعلاه يرجى التكرم بالنظر في </w:t>
+        <w:t xml:space="preserve"> وإعمالا لأحكام القانون  رقم 182 لسنة 2018 ولائحته التنفيذيه بشأن تنظيم التعاقدات التي تبرمها الجهات العامه وبالإشارة إلى كراسة الشروط والمواصفات الخاصه بالعمليه المذكوره أعلاه يرجى التكرم بالنظر في </w:t>
       </w:r>
       <w:r>
         <w:rPr>
@@ -724,79 +602,7 @@
           <w:rtl/>
           <w:lang w:bidi="ar-EG"/>
         </w:rPr>
-        <w:t xml:space="preserve"> والقانونيه المبينه أدناه </w:t>
-      </w:r>
-      <w:r>
-        <w:rPr>
-          <w:rFonts w:hint="cs"/>
-          <w:b/>
-          <w:bCs/>
-          <w:sz w:val="28"/>
-          <w:szCs w:val="28"/>
-          <w:rtl/>
-          <w:lang w:bidi="ar-EG"/>
-        </w:rPr>
-        <w:t>والرد علينا بخطاب</w:t>
-      </w:r>
-      <w:r>
-        <w:rPr>
-          <w:rFonts w:hint="cs"/>
-          <w:b/>
-          <w:bCs/>
-          <w:sz w:val="28"/>
-          <w:szCs w:val="28"/>
-          <w:rtl/>
-          <w:lang w:bidi="ar-EG"/>
-        </w:rPr>
-        <w:t xml:space="preserve"> معتمد </w:t>
-      </w:r>
-      <w:r>
-        <w:rPr>
-          <w:rFonts w:hint="cs"/>
-          <w:b/>
-          <w:bCs/>
-          <w:sz w:val="28"/>
-          <w:szCs w:val="28"/>
-          <w:rtl/>
-          <w:lang w:bidi="ar-EG"/>
-        </w:rPr>
-        <w:t>و</w:t>
-      </w:r>
-      <w:r>
-        <w:rPr>
-          <w:rFonts w:hint="cs"/>
-          <w:b/>
-          <w:bCs/>
-          <w:sz w:val="28"/>
-          <w:szCs w:val="28"/>
-          <w:rtl/>
-          <w:lang w:bidi="ar-EG"/>
-        </w:rPr>
-        <w:t>موافا</w:t>
-      </w:r>
-      <w:r>
-        <w:rPr>
-          <w:rFonts w:hint="cs"/>
-          <w:b/>
-          <w:bCs/>
-          <w:sz w:val="28"/>
-          <w:szCs w:val="28"/>
-          <w:rtl/>
-          <w:lang w:bidi="ar-EG"/>
-        </w:rPr>
-        <w:t xml:space="preserve">تنا </w:t>
-      </w:r>
-      <w:r>
-        <w:rPr>
-          <w:rFonts w:hint="cs"/>
-          <w:b/>
-          <w:bCs/>
-          <w:sz w:val="28"/>
-          <w:szCs w:val="28"/>
-          <w:rtl/>
-          <w:lang w:bidi="ar-EG"/>
-        </w:rPr>
-        <w:t xml:space="preserve">قبل الموعد المحدد </w:t>
+        <w:t xml:space="preserve"> والقانونيه المبينه أدناه والرد علينا بخطاب معتمد وموافاتنا قبل الموعد المحدد </w:t>
       </w:r>
       <w:r>
         <w:rPr>
@@ -821,31 +627,7 @@
           <w:rtl/>
           <w:lang w:bidi="ar-EG"/>
         </w:rPr>
-        <w:t xml:space="preserve"> والب</w:t>
-      </w:r>
-      <w:r>
-        <w:rPr>
-          <w:rFonts w:hint="cs"/>
-          <w:b/>
-          <w:bCs/>
-          <w:sz w:val="28"/>
-          <w:szCs w:val="28"/>
-          <w:rtl/>
-          <w:lang w:bidi="ar-EG"/>
-        </w:rPr>
-        <w:t xml:space="preserve">نود والموضوعات المطلوب رفع التظلم عنها </w:t>
-      </w:r>
-      <w:r>
-        <w:rPr>
-          <w:rFonts w:hint="cs"/>
-          <w:b/>
-          <w:bCs/>
-          <w:sz w:val="28"/>
-          <w:szCs w:val="28"/>
-          <w:rtl/>
-          <w:lang w:bidi="ar-EG"/>
-        </w:rPr>
-        <w:t>كالتالى :ـ</w:t>
+        <w:t xml:space="preserve"> والبنود والموضوعات المطلوب رفع التظلم عنها كالتالى :ـ</w:t>
       </w:r>
     </w:p>
     <w:p>
@@ -1015,6 +797,7 @@
                 <w:bCs/>
                 <w:sz w:val="40"/>
                 <w:szCs w:val="40"/>
+                <w:rtl/>
                 <w:lang w:bidi="ar-EG"/>
               </w:rPr>
             </w:pPr>
@@ -1053,13 +836,12 @@
                 <w:bCs/>
                 <w:sz w:val="40"/>
                 <w:szCs w:val="40"/>
-                <w:rtl/>
                 <w:lang w:bidi="ar-EG"/>
               </w:rPr>
             </w:pPr>
             <w:r>
               <w:rPr>
-                <w:rFonts w:ascii="Arabic Typesetting" w:hAnsi="Arabic Typesetting" w:cs="Arabic Typesetting" w:hint="cs"/>
+                <w:rFonts w:ascii="Arabic Typesetting" w:hAnsi="Arabic Typesetting" w:cs="Arabic Typesetting"/>
                 <w:b/>
                 <w:bCs/>
                 <w:sz w:val="40"/>
@@ -1067,35 +849,11 @@
                 <w:rtl/>
                 <w:lang w:bidi="ar-EG"/>
               </w:rPr>
-              <w:t>إ</w:t>
+              <w:t xml:space="preserve">إســــــــم </w:t>
             </w:r>
             <w:r>
               <w:rPr>
                 <w:rFonts w:ascii="Arabic Typesetting" w:hAnsi="Arabic Typesetting" w:cs="Arabic Typesetting"/>
-                <w:b/>
-                <w:bCs/>
-                <w:sz w:val="40"/>
-                <w:szCs w:val="40"/>
-                <w:rtl/>
-                <w:lang w:bidi="ar-EG"/>
-              </w:rPr>
-              <w:t>س</w:t>
-            </w:r>
-            <w:r>
-              <w:rPr>
-                <w:rFonts w:ascii="Arabic Typesetting" w:hAnsi="Arabic Typesetting" w:cs="Arabic Typesetting" w:hint="cs"/>
-                <w:b/>
-                <w:bCs/>
-                <w:sz w:val="40"/>
-                <w:szCs w:val="40"/>
-                <w:rtl/>
-                <w:lang w:bidi="ar-EG"/>
-              </w:rPr>
-              <w:t xml:space="preserve">ــــــــم </w:t>
-            </w:r>
-            <w:r>
-              <w:rPr>
-                <w:rFonts w:ascii="Arabic Typesetting" w:hAnsi="Arabic Typesetting" w:cs="Arabic Typesetting" w:hint="cs"/>
                 <w:b/>
                 <w:bCs/>
                 <w:sz w:val="40"/>
@@ -1108,7 +866,7 @@
             </w:r>
             <w:r>
               <w:rPr>
-                <w:rFonts w:ascii="Arabic Typesetting" w:hAnsi="Arabic Typesetting" w:cs="Arabic Typesetting" w:hint="cs"/>
+                <w:rFonts w:ascii="Arabic Typesetting" w:hAnsi="Arabic Typesetting" w:cs="Arabic Typesetting"/>
                 <w:b/>
                 <w:bCs/>
                 <w:sz w:val="40"/>
@@ -1147,7 +905,7 @@
             </w:pPr>
             <w:r>
               <w:rPr>
-                <w:rFonts w:ascii="Arabic Typesetting" w:hAnsi="Arabic Typesetting" w:cs="Arabic Typesetting" w:hint="cs"/>
+                <w:rFonts w:ascii="Arabic Typesetting" w:hAnsi="Arabic Typesetting" w:cs="Arabic Typesetting"/>
                 <w:b/>
                 <w:bCs/>
                 <w:sz w:val="40"/>
@@ -1195,85 +953,7 @@
                 <w:rtl/>
                 <w:lang w:bidi="ar-EG"/>
               </w:rPr>
-              <w:t>الوص</w:t>
-            </w:r>
-            <w:r>
-              <w:rPr>
-                <w:rFonts w:ascii="Arabic Typesetting" w:hAnsi="Arabic Typesetting" w:cs="Arabic Typesetting" w:hint="cs"/>
-                <w:b/>
-                <w:bCs/>
-                <w:sz w:val="40"/>
-                <w:szCs w:val="40"/>
-                <w:highlight w:val="red"/>
-                <w:rtl/>
-                <w:lang w:bidi="ar-EG"/>
-              </w:rPr>
-              <w:t>ــ</w:t>
-            </w:r>
-            <w:r>
-              <w:rPr>
-                <w:rFonts w:ascii="Arabic Typesetting" w:hAnsi="Arabic Typesetting" w:cs="Arabic Typesetting"/>
-                <w:b/>
-                <w:bCs/>
-                <w:sz w:val="40"/>
-                <w:szCs w:val="40"/>
-                <w:highlight w:val="red"/>
-                <w:rtl/>
-                <w:lang w:bidi="ar-EG"/>
-              </w:rPr>
-              <w:t>ف</w:t>
-            </w:r>
-            <w:r>
-              <w:rPr>
-                <w:rFonts w:ascii="Arabic Typesetting" w:hAnsi="Arabic Typesetting" w:cs="Arabic Typesetting" w:hint="cs"/>
-                <w:b/>
-                <w:bCs/>
-                <w:sz w:val="40"/>
-                <w:szCs w:val="40"/>
-                <w:highlight w:val="red"/>
-                <w:rtl/>
-                <w:lang w:bidi="ar-EG"/>
-              </w:rPr>
-              <w:t xml:space="preserve"> </w:t>
-            </w:r>
-            <w:r>
-              <w:rPr>
-                <w:rFonts w:ascii="Arabic Typesetting" w:hAnsi="Arabic Typesetting" w:cs="Arabic Typesetting" w:hint="cs"/>
-                <w:b/>
-                <w:bCs/>
-                <w:sz w:val="40"/>
-                <w:szCs w:val="40"/>
-                <w:highlight w:val="red"/>
-                <w:rtl/>
-                <w:lang w:bidi="ar-EG"/>
-              </w:rPr>
-              <w:t xml:space="preserve">أو </w:t>
-            </w:r>
-            <w:r>
-              <w:rPr>
-                <w:rFonts w:ascii="Arabic Typesetting" w:hAnsi="Arabic Typesetting" w:cs="Arabic Typesetting" w:hint="cs"/>
-                <w:b/>
-                <w:bCs/>
-                <w:sz w:val="40"/>
-                <w:szCs w:val="40"/>
-                <w:highlight w:val="red"/>
-                <w:rtl/>
-                <w:lang w:bidi="ar-EG"/>
-              </w:rPr>
-              <w:t>ال</w:t>
-            </w:r>
-            <w:r>
-              <w:rPr>
-                <w:rFonts w:ascii="Arabic Typesetting" w:hAnsi="Arabic Typesetting" w:cs="Arabic Typesetting" w:hint="cs"/>
-                <w:b/>
-                <w:bCs/>
-                <w:sz w:val="40"/>
-                <w:szCs w:val="40"/>
-                <w:highlight w:val="red"/>
-                <w:rtl/>
-                <w:lang w:bidi="ar-EG"/>
-              </w:rPr>
-              <w:t>اجراء المتخذ</w:t>
+              <w:t>الوصــف أو الاجراء المتخذ</w:t>
             </w:r>
             <w:r>
               <w:rPr>
@@ -1316,7 +996,7 @@
             </w:pPr>
             <w:r>
               <w:rPr>
-                <w:rFonts w:ascii="Arabic Typesetting" w:hAnsi="Arabic Typesetting" w:cs="Arabic Typesetting" w:hint="cs"/>
+                <w:rFonts w:ascii="Arabic Typesetting" w:hAnsi="Arabic Typesetting" w:cs="Arabic Typesetting"/>
                 <w:b/>
                 <w:bCs/>
                 <w:sz w:val="40"/>
@@ -2360,13 +2040,22 @@
     <w:p>
       <w:pPr>
         <w:spacing w:after="0" w:line="240" w:lineRule="auto"/>
-        <w:ind w:left="-567" w:hanging="283"/>
+        <w:ind w:left="-1134"/>
+        <w:rPr>
+          <w:rtl/>
+          <w:lang w:bidi="ar-EG"/>
+        </w:rPr>
+      </w:pPr>
+    </w:p>
+    <w:p>
+      <w:pPr>
+        <w:spacing w:after="0" w:line="240" w:lineRule="auto"/>
         <w:jc w:val="center"/>
         <w:rPr>
           <w:b/>
           <w:bCs/>
-          <w:sz w:val="44"/>
-          <w:szCs w:val="44"/>
+          <w:sz w:val="36"/>
+          <w:szCs w:val="36"/>
           <w:u w:val="single"/>
           <w:rtl/>
           <w:lang w:bidi="ar-EG"/>
@@ -2377,8 +2066,8 @@
           <w:rFonts w:hint="cs"/>
           <w:b/>
           <w:bCs/>
-          <w:sz w:val="44"/>
-          <w:szCs w:val="44"/>
+          <w:sz w:val="36"/>
+          <w:szCs w:val="36"/>
           <w:u w:val="single"/>
           <w:rtl/>
           <w:lang w:bidi="ar-EG"/>
@@ -2477,7 +2166,29 @@
           <w:rtl/>
           <w:lang w:bidi="ar-EG"/>
         </w:rPr>
-        <w:t xml:space="preserve">           </w:t>
+        <w:t xml:space="preserve">     </w:t>
+      </w:r>
+      <w:r>
+        <w:rPr>
+          <w:b/>
+          <w:bCs/>
+          <w:sz w:val="28"/>
+          <w:szCs w:val="28"/>
+          <w:lang w:bidi="ar-EG"/>
+        </w:rPr>
+        <w:t xml:space="preserve">             </w:t>
+      </w:r>
+      <w:r>
+        <w:rPr>
+          <w:rFonts w:hint="cs"/>
+          <w:b/>
+          <w:bCs/>
+          <w:sz w:val="28"/>
+          <w:szCs w:val="28"/>
+          <w:rtl/>
+          <w:lang w:bidi="ar-EG"/>
+        </w:rPr>
+        <w:t xml:space="preserve">      </w:t>
       </w:r>
       <w:r>
         <w:rPr>
@@ -2537,7 +2248,18 @@
           <w:bCs/>
           <w:sz w:val="24"/>
           <w:szCs w:val="24"/>
-          <w:highlight w:val="red"/>
+          <w:rtl/>
+          <w:lang w:bidi="ar-EG"/>
+        </w:rPr>
+        <w:t xml:space="preserve">       </w:t>
+      </w:r>
+      <w:r>
+        <w:rPr>
+          <w:rFonts w:hint="cs"/>
+          <w:b/>
+          <w:bCs/>
+          <w:sz w:val="24"/>
+          <w:szCs w:val="24"/>
           <w:rtl/>
           <w:lang w:bidi="ar-EG"/>
         </w:rPr>
@@ -2645,7 +2367,42 @@
           <w:rtl/>
           <w:lang w:bidi="ar-EG"/>
         </w:rPr>
-        <w:t xml:space="preserve">المدير المالى                            </w:t>
+        <w:t xml:space="preserve">المدير المالى              </w:t>
+      </w:r>
+      <w:r>
+        <w:rPr>
+          <w:rFonts w:hint="cs"/>
+          <w:b/>
+          <w:bCs/>
+          <w:sz w:val="32"/>
+          <w:szCs w:val="32"/>
+          <w:rtl/>
+          <w:lang w:bidi="ar-EG"/>
+        </w:rPr>
+        <w:t xml:space="preserve">      </w:t>
+      </w:r>
+      <w:r>
+        <w:rPr>
+          <w:b/>
+          <w:bCs/>
+          <w:sz w:val="32"/>
+          <w:szCs w:val="32"/>
+          <w:rtl/>
+          <w:lang w:bidi="ar-EG"/>
+        </w:rPr>
+        <w:t xml:space="preserve">     </w:t>
+      </w:r>
+      <w:r>
+        <w:rPr>
+          <w:rFonts w:hint="cs"/>
+          <w:b/>
+          <w:bCs/>
+          <w:sz w:val="32"/>
+          <w:szCs w:val="32"/>
+          <w:rtl/>
+          <w:lang w:bidi="ar-EG"/>
+        </w:rPr>
+        <w:t xml:space="preserve"> </w:t>
       </w:r>
       <w:r>
         <w:rPr>
@@ -2662,8 +2419,6 @@
     <w:p>
       <w:pPr>
         <w:spacing w:after="0" w:line="240" w:lineRule="auto"/>
-        <w:ind w:left="-2211"/>
-        <w:jc w:val="center"/>
         <w:rPr>
           <w:b/>
           <w:bCs/>
@@ -2675,6 +2430,7 @@
       </w:pPr>
       <w:r>
         <w:rPr>
+          <w:rFonts w:hint="cs"/>
           <w:b/>
           <w:bCs/>
           <w:sz w:val="32"/>
@@ -2686,43 +2442,6 @@
       </w:r>
       <w:r>
         <w:rPr>
-          <w:rtl/>
-          <w:lang w:bidi="ar-EG"/>
-        </w:rPr>
-        <w:t xml:space="preserve"> </w:t>
-      </w:r>
-      <w:r>
-        <w:rPr>
-          <w:highlight w:val="red"/>
-          <w:rtl/>
-          <w:lang w:bidi="ar-EG"/>
-        </w:rPr>
-        <w:t>أحمد محمد</w:t>
-      </w:r>
-      <w:r>
-        <w:rPr>
-          <w:rtl/>
-          <w:lang w:bidi="ar-EG"/>
-        </w:rPr>
-        <w:t xml:space="preserve">                </w:t>
-      </w:r>
-      <w:r>
-        <w:rPr>
-          <w:rFonts w:hint="cs"/>
-          <w:rtl/>
-          <w:lang w:bidi="ar-EG"/>
-        </w:rPr>
-        <w:t xml:space="preserve">          </w:t>
-      </w:r>
-      <w:r>
-        <w:rPr>
-          <w:rtl/>
-          <w:lang w:bidi="ar-EG"/>
-        </w:rPr>
-        <w:t xml:space="preserve">    </w:t>
-      </w:r>
-      <w:r>
-        <w:rPr>
           <w:b/>
           <w:bCs/>
           <w:sz w:val="32"/>
@@ -2734,6 +2453,87 @@
       </w:r>
       <w:r>
         <w:rPr>
+          <w:rtl/>
+          <w:lang w:bidi="ar-EG"/>
+        </w:rPr>
+        <w:t xml:space="preserve"> </w:t>
+      </w:r>
+      <w:r>
+        <w:rPr>
+          <w:highlight w:val="red"/>
+          <w:rtl/>
+          <w:lang w:bidi="ar-EG"/>
+        </w:rPr>
+        <w:t>أحمد محمد</w:t>
+      </w:r>
+      <w:r>
+        <w:rPr>
+          <w:rtl/>
+          <w:lang w:bidi="ar-EG"/>
+        </w:rPr>
+        <w:t xml:space="preserve">                 </w:t>
+      </w:r>
+      <w:r>
+        <w:rPr>
+          <w:rFonts w:hint="cs"/>
+          <w:rtl/>
+          <w:lang w:bidi="ar-EG"/>
+        </w:rPr>
+        <w:t xml:space="preserve">       </w:t>
+      </w:r>
+      <w:r>
+        <w:rPr>
+          <w:rFonts w:hint="cs"/>
+          <w:rtl/>
+          <w:lang w:bidi="ar-EG"/>
+        </w:rPr>
+        <w:t xml:space="preserve">  </w:t>
+      </w:r>
+      <w:r>
+        <w:rPr>
+          <w:rFonts w:hint="cs"/>
+          <w:rtl/>
+          <w:lang w:bidi="ar-EG"/>
+        </w:rPr>
+        <w:t xml:space="preserve">  </w:t>
+      </w:r>
+      <w:r>
+        <w:rPr>
+          <w:rFonts w:hint="cs"/>
+          <w:rtl/>
+          <w:lang w:bidi="ar-EG"/>
+        </w:rPr>
+        <w:t xml:space="preserve">     </w:t>
+      </w:r>
+      <w:r>
+        <w:rPr>
+          <w:rFonts w:hint="cs"/>
+          <w:rtl/>
+          <w:lang w:bidi="ar-EG"/>
+        </w:rPr>
+        <w:t xml:space="preserve"> </w:t>
+      </w:r>
+      <w:r>
+        <w:rPr>
+          <w:rtl/>
+          <w:lang w:bidi="ar-EG"/>
+        </w:rPr>
+        <w:t xml:space="preserve">    </w:t>
+      </w:r>
+      <w:r>
+        <w:rPr>
+          <w:b/>
+          <w:bCs/>
+          <w:sz w:val="32"/>
+          <w:szCs w:val="32"/>
+          <w:rtl/>
+          <w:lang w:bidi="ar-EG"/>
+        </w:rPr>
+        <w:t xml:space="preserve">  </w:t>
+      </w:r>
+      <w:r>
+        <w:rPr>
+          <w:rFonts w:hint="cs"/>
           <w:b/>
           <w:bCs/>
           <w:sz w:val="32"/>
@@ -2742,7 +2542,30 @@
           <w:rtl/>
           <w:lang w:bidi="ar-EG"/>
         </w:rPr>
-        <w:t>أو اسم</w:t>
+        <w:t xml:space="preserve"> </w:t>
+      </w:r>
+      <w:r>
+        <w:rPr>
+          <w:b/>
+          <w:bCs/>
+          <w:sz w:val="32"/>
+          <w:szCs w:val="32"/>
+          <w:highlight w:val="red"/>
+          <w:rtl/>
+          <w:lang w:bidi="ar-EG"/>
+        </w:rPr>
+        <w:t>اسم</w:t>
+      </w:r>
+      <w:r>
+        <w:rPr>
+          <w:b/>
+          <w:bCs/>
+          <w:sz w:val="32"/>
+          <w:szCs w:val="32"/>
+          <w:rtl/>
+          <w:lang w:bidi="ar-EG"/>
+        </w:rPr>
+        <w:t xml:space="preserve"> </w:t>
       </w:r>
       <w:r>
         <w:rPr>
@@ -2754,7 +2577,7 @@
           <w:rtl/>
           <w:lang w:bidi="ar-EG"/>
         </w:rPr>
-        <w:t xml:space="preserve">              </w:t>
+        <w:t xml:space="preserve">      </w:t>
       </w:r>
       <w:r>
         <w:rPr>
@@ -2765,7 +2588,91 @@
           <w:rtl/>
           <w:lang w:bidi="ar-EG"/>
         </w:rPr>
-        <w:t xml:space="preserve">      </w:t>
+        <w:t xml:space="preserve">    </w:t>
+      </w:r>
+      <w:r>
+        <w:rPr>
+          <w:rFonts w:hint="cs"/>
+          <w:b/>
+          <w:bCs/>
+          <w:sz w:val="32"/>
+          <w:szCs w:val="32"/>
+          <w:rtl/>
+          <w:lang w:bidi="ar-EG"/>
+        </w:rPr>
+        <w:t xml:space="preserve"> </w:t>
+      </w:r>
+      <w:r>
+        <w:rPr>
+          <w:rFonts w:hint="cs"/>
+          <w:b/>
+          <w:bCs/>
+          <w:sz w:val="32"/>
+          <w:szCs w:val="32"/>
+          <w:rtl/>
+          <w:lang w:bidi="ar-EG"/>
+        </w:rPr>
+        <w:t xml:space="preserve">   </w:t>
+      </w:r>
+      <w:r>
+        <w:rPr>
+          <w:rFonts w:hint="cs"/>
+          <w:b/>
+          <w:bCs/>
+          <w:sz w:val="32"/>
+          <w:szCs w:val="32"/>
+          <w:rtl/>
+          <w:lang w:bidi="ar-EG"/>
+        </w:rPr>
+        <w:t xml:space="preserve"> </w:t>
+      </w:r>
+      <w:r>
+        <w:rPr>
+          <w:rFonts w:hint="cs"/>
+          <w:b/>
+          <w:bCs/>
+          <w:sz w:val="32"/>
+          <w:szCs w:val="32"/>
+          <w:rtl/>
+          <w:lang w:bidi="ar-EG"/>
+        </w:rPr>
+        <w:t xml:space="preserve">       </w:t>
+      </w:r>
+      <w:r>
+        <w:rPr>
+          <w:rFonts w:hint="cs"/>
+          <w:b/>
+          <w:bCs/>
+          <w:sz w:val="32"/>
+          <w:szCs w:val="32"/>
+          <w:rtl/>
+          <w:lang w:bidi="ar-EG"/>
+        </w:rPr>
+        <w:t xml:space="preserve"> </w:t>
+      </w:r>
+      <w:r>
+        <w:rPr>
+          <w:rFonts w:hint="cs"/>
+          <w:b/>
+          <w:bCs/>
+          <w:sz w:val="32"/>
+          <w:szCs w:val="32"/>
+          <w:rtl/>
+          <w:lang w:bidi="ar-EG"/>
+        </w:rPr>
+        <w:t xml:space="preserve"> </w:t>
+      </w:r>
+      <w:r>
+        <w:rPr>
+          <w:rFonts w:hint="cs"/>
+          <w:b/>
+          <w:bCs/>
+          <w:sz w:val="32"/>
+          <w:szCs w:val="32"/>
+          <w:rtl/>
+          <w:lang w:bidi="ar-EG"/>
+        </w:rPr>
+        <w:t xml:space="preserve">  </w:t>
       </w:r>
       <w:r>
         <w:rPr>
@@ -2784,7 +2691,6 @@
         <w:spacing w:after="0" w:line="240" w:lineRule="auto"/>
         <w:ind w:left="-1134"/>
         <w:rPr>
-          <w:rtl/>
           <w:lang w:bidi="ar-EG"/>
         </w:rPr>
       </w:pPr>
@@ -2800,39 +2706,35 @@
     <w:p>
       <w:pPr>
         <w:spacing w:after="0" w:line="240" w:lineRule="auto"/>
-        <w:ind w:left="-1134"/>
         <w:rPr>
           <w:rtl/>
           <w:lang w:bidi="ar-EG"/>
         </w:rPr>
       </w:pPr>
-    </w:p>
-    <w:p>
-      <w:pPr>
-        <w:spacing w:after="0" w:line="240" w:lineRule="auto"/>
-        <w:rPr>
-          <w:rtl/>
-          <w:lang w:bidi="ar-EG"/>
-        </w:rPr>
-      </w:pPr>
-    </w:p>
-    <w:p>
-      <w:pPr>
-        <w:spacing w:after="0" w:line="240" w:lineRule="auto"/>
-        <w:rPr>
-          <w:rtl/>
-          <w:lang w:bidi="ar-EG"/>
-        </w:rPr>
-      </w:pPr>
-    </w:p>
-    <w:p>
-      <w:pPr>
-        <w:spacing w:after="0" w:line="240" w:lineRule="auto"/>
-        <w:rPr>
-          <w:rtl/>
-          <w:lang w:bidi="ar-EG"/>
-        </w:rPr>
-      </w:pPr>
+      <w:r>
+        <w:rPr>
+          <w:rFonts w:hint="cs"/>
+          <w:rtl/>
+          <w:lang w:bidi="ar-EG"/>
+        </w:rPr>
+        <w:t xml:space="preserve">             </w:t>
+      </w:r>
+      <w:r>
+        <w:rPr>
+          <w:rFonts w:hint="cs"/>
+          <w:rtl/>
+          <w:lang w:bidi="ar-EG"/>
+        </w:rPr>
+        <w:t xml:space="preserve"> </w:t>
+      </w:r>
+      <w:r>
+        <w:rPr>
+          <w:rFonts w:hint="cs"/>
+          <w:rtl/>
+          <w:lang w:bidi="ar-EG"/>
+        </w:rPr>
+        <w:t xml:space="preserve">                                       </w:t>
+      </w:r>
     </w:p>
     <w:sectPr>
       <w:headerReference w:type="even" r:id="rId8"/>
@@ -2906,13 +2808,224 @@
     <w:bookmarkStart w:id="0" w:name="_Hlk242974069"/>
     <w:r>
       <w:rPr>
+        <w:b/>
+        <w:bCs/>
+        <w:noProof/>
+        <w:lang w:bidi="ar-EG"/>
+      </w:rPr>
+      <mc:AlternateContent>
+        <mc:Choice Requires="wps">
+          <w:drawing>
+            <wp:anchor distT="45720" distB="45720" distL="114300" distR="114300" simplePos="0" relativeHeight="251661312" behindDoc="0" locked="0" layoutInCell="1" allowOverlap="1" wp14:anchorId="008ACA3B" wp14:editId="2529423B">
+              <wp:simplePos x="0" y="0"/>
+              <wp:positionH relativeFrom="column">
+                <wp:posOffset>-122646</wp:posOffset>
+              </wp:positionH>
+              <wp:positionV relativeFrom="paragraph">
+                <wp:posOffset>-10251</wp:posOffset>
+              </wp:positionV>
+              <wp:extent cx="2573020" cy="285750"/>
+              <wp:effectExtent l="0" t="0" r="0" b="0"/>
+              <wp:wrapSquare wrapText="bothSides"/>
+              <wp:docPr id="217" name="Text Box 2"/>
+              <wp:cNvGraphicFramePr>
+                <a:graphicFrameLocks xmlns:a="http://schemas.openxmlformats.org/drawingml/2006/main"/>
+              </wp:cNvGraphicFramePr>
+              <a:graphic xmlns:a="http://schemas.openxmlformats.org/drawingml/2006/main">
+                <a:graphicData uri="http://schemas.microsoft.com/office/word/2010/wordprocessingShape">
+                  <wps:wsp>
+                    <wps:cNvSpPr txBox="1">
+                      <a:spLocks noChangeArrowheads="1"/>
+                    </wps:cNvSpPr>
+                    <wps:spPr bwMode="auto">
+                      <a:xfrm>
+                        <a:off x="0" y="0"/>
+                        <a:ext cx="2573020" cy="285750"/>
+                      </a:xfrm>
+                      <a:prstGeom prst="rect">
+                        <a:avLst/>
+                      </a:prstGeom>
+                      <a:noFill/>
+                      <a:ln w="9525">
+                        <a:noFill/>
+                        <a:miter lim="800000"/>
+                        <a:headEnd/>
+                        <a:tailEnd/>
+                      </a:ln>
+                    </wps:spPr>
+                    <wps:txbx>
+                      <w:txbxContent>
+                        <w:p>
+                          <w:r>
+                            <w:rPr>
+                              <w:rFonts w:ascii="Times New Roman" w:eastAsia="Franklin Gothic Medium" w:hAnsi="Times New Roman" w:cs="Times New Roman"/>
+                              <w:b/>
+                              <w:bCs/>
+                              <w:i/>
+                              <w:iCs/>
+                              <w:rtl/>
+                            </w:rPr>
+                            <w:t xml:space="preserve">واتساب </w:t>
+                          </w:r>
+                          <w:r>
+                            <w:rPr>
+                              <w:rFonts w:ascii="Times New Roman" w:eastAsia="Franklin Gothic Medium" w:hAnsi="Times New Roman" w:cs="Times New Roman" w:hint="cs"/>
+                              <w:b/>
+                              <w:bCs/>
+                              <w:i/>
+                              <w:iCs/>
+                              <w:rtl/>
+                            </w:rPr>
+                            <w:t xml:space="preserve">/ </w:t>
+                          </w:r>
+                          <w:r>
+                            <w:rPr>
+                              <w:rFonts w:ascii="Times New Roman" w:eastAsia="Franklin Gothic Medium" w:hAnsi="Times New Roman" w:cs="Times New Roman" w:hint="cs"/>
+                              <w:b/>
+                              <w:bCs/>
+                              <w:i/>
+                              <w:iCs/>
+                              <w:highlight w:val="red"/>
+                              <w:rtl/>
+                            </w:rPr>
+                            <w:t>01091708818</w:t>
+                          </w:r>
+                          <w:r>
+                            <w:rPr>
+                              <w:rFonts w:ascii="Times New Roman" w:eastAsia="Franklin Gothic Medium" w:hAnsi="Times New Roman" w:cs="Times New Roman" w:hint="cs"/>
+                              <w:b/>
+                              <w:bCs/>
+                              <w:i/>
+                              <w:iCs/>
+                              <w:rtl/>
+                            </w:rPr>
+                            <w:t xml:space="preserve">  م /    </w:t>
+                          </w:r>
+                          <w:r>
+                            <w:rPr>
+                              <w:rFonts w:ascii="Times New Roman" w:eastAsia="Franklin Gothic Medium" w:hAnsi="Times New Roman" w:cs="Times New Roman" w:hint="cs"/>
+                              <w:b/>
+                              <w:bCs/>
+                              <w:i/>
+                              <w:iCs/>
+                              <w:highlight w:val="red"/>
+                              <w:rtl/>
+                            </w:rPr>
+                            <w:t>01557018818</w:t>
+                          </w:r>
+                        </w:p>
+                      </w:txbxContent>
+                    </wps:txbx>
+                    <wps:bodyPr rot="0" vert="horz" wrap="square" lIns="91440" tIns="45720" rIns="91440" bIns="45720" anchor="t" anchorCtr="0">
+                      <a:noAutofit/>
+                    </wps:bodyPr>
+                  </wps:wsp>
+                </a:graphicData>
+              </a:graphic>
+              <wp14:sizeRelH relativeFrom="margin">
+                <wp14:pctWidth>0</wp14:pctWidth>
+              </wp14:sizeRelH>
+              <wp14:sizeRelV relativeFrom="margin">
+                <wp14:pctHeight>0</wp14:pctHeight>
+              </wp14:sizeRelV>
+            </wp:anchor>
+          </w:drawing>
+        </mc:Choice>
+        <mc:Fallback>
+          <w:pict>
+            <v:shapetype w14:anchorId="008ACA3B" id="_x0000_t202" coordsize="21600,21600" o:spt="202" path="m,l,21600r21600,l21600,xe">
+              <v:stroke joinstyle="miter"/>
+              <v:path gradientshapeok="t" o:connecttype="rect"/>
+            </v:shapetype>
+            <v:shape id="Text Box 2" o:spid="_x0000_s1026" type="#_x0000_t202" style="position:absolute;left:0;text-align:left;margin-left:-9.65pt;margin-top:-.8pt;width:202.6pt;height:22.5pt;z-index:251661312;visibility:visible;mso-wrap-style:square;mso-width-percent:0;mso-height-percent:0;mso-wrap-distance-left:9pt;mso-wrap-distance-top:3.6pt;mso-wrap-distance-right:9pt;mso-wrap-distance-bottom:3.6pt;mso-position-horizontal:absolute;mso-position-horizontal-relative:text;mso-position-vertical:absolute;mso-position-vertical-relative:text;mso-width-percent:0;mso-height-percent:0;mso-width-relative:margin;mso-height-relative:margin;v-text-anchor:top" o:gfxdata="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" filled="f" stroked="f">
+              <v:textbox>
+                <w:txbxContent>
+                  <w:p>
+                    <w:r>
+                      <w:rPr>
+                        <w:rFonts w:ascii="Times New Roman" w:eastAsia="Franklin Gothic Medium" w:hAnsi="Times New Roman" w:cs="Times New Roman"/>
+                        <w:b/>
+                        <w:bCs/>
+                        <w:i/>
+                        <w:iCs/>
+                        <w:rtl/>
+                      </w:rPr>
+                      <w:t xml:space="preserve">واتساب </w:t>
+                    </w:r>
+                    <w:r>
+                      <w:rPr>
+                        <w:rFonts w:ascii="Times New Roman" w:eastAsia="Franklin Gothic Medium" w:hAnsi="Times New Roman" w:cs="Times New Roman" w:hint="cs"/>
+                        <w:b/>
+                        <w:bCs/>
+                        <w:i/>
+                        <w:iCs/>
+                        <w:rtl/>
+                      </w:rPr>
+                      <w:t xml:space="preserve">/ </w:t>
+                    </w:r>
+                    <w:r>
+                      <w:rPr>
+                        <w:rFonts w:ascii="Times New Roman" w:eastAsia="Franklin Gothic Medium" w:hAnsi="Times New Roman" w:cs="Times New Roman" w:hint="cs"/>
+                        <w:b/>
+                        <w:bCs/>
+                        <w:i/>
+                        <w:iCs/>
+                        <w:highlight w:val="red"/>
+                        <w:rtl/>
+                      </w:rPr>
+                      <w:t>01091708818</w:t>
+                    </w:r>
+                    <w:r>
+                      <w:rPr>
+                        <w:rFonts w:ascii="Times New Roman" w:eastAsia="Franklin Gothic Medium" w:hAnsi="Times New Roman" w:cs="Times New Roman" w:hint="cs"/>
+                        <w:b/>
+                        <w:bCs/>
+                        <w:i/>
+                        <w:iCs/>
+                        <w:rtl/>
+                      </w:rPr>
+                      <w:t xml:space="preserve">  م /    </w:t>
+                    </w:r>
+                    <w:r>
+                      <w:rPr>
+                        <w:rFonts w:ascii="Times New Roman" w:eastAsia="Franklin Gothic Medium" w:hAnsi="Times New Roman" w:cs="Times New Roman" w:hint="cs"/>
+                        <w:b/>
+                        <w:bCs/>
+                        <w:i/>
+                        <w:iCs/>
+                        <w:highlight w:val="red"/>
+                        <w:rtl/>
+                      </w:rPr>
+                      <w:t>01557018818</w:t>
+                    </w:r>
+                  </w:p>
+                </w:txbxContent>
+              </v:textbox>
+              <w10:wrap type="square"/>
+            </v:shape>
+          </w:pict>
+        </mc:Fallback>
+      </mc:AlternateContent>
+    </w:r>
+    <w:r>
+      <w:rPr>
         <w:rFonts w:hint="cs"/>
         <w:b/>
         <w:bCs/>
         <w:rtl/>
         <w:lang w:bidi="ar-EG"/>
       </w:rPr>
-      <w:t>التاريخ الصادر:</w:t>
+      <w:t xml:space="preserve">التاريخ </w:t>
+    </w:r>
+    <w:r>
+      <w:rPr>
+        <w:rFonts w:hint="cs"/>
+        <w:b/>
+        <w:bCs/>
+        <w:rtl/>
+        <w:lang w:bidi="ar-EG"/>
+      </w:rPr>
+      <w:t>الصادر:</w:t>
     </w:r>
     <w:r>
       <w:rPr>
@@ -2958,7 +3071,6 @@
       </w:rPr>
       <w:t xml:space="preserve">  </w:t>
     </w:r>
-    <w:bookmarkEnd w:id="0"/>
     <w:r>
       <w:rPr>
         <w:rFonts w:hint="cs"/>
@@ -2966,105 +3078,34 @@
         <w:rtl/>
         <w:lang w:bidi="ar-EG"/>
       </w:rPr>
+      <w:t xml:space="preserve"> </w:t>
+    </w:r>
+    <w:bookmarkEnd w:id="0"/>
+    <w:r>
+      <w:rPr>
+        <w:b/>
+        <w:bCs/>
+        <w:highlight w:val="red"/>
+        <w:rtl/>
+        <w:lang w:bidi="ar-EG"/>
+      </w:rPr>
       <w:t>رقم القيد</w:t>
     </w:r>
     <w:r>
       <w:rPr>
-        <w:rFonts w:ascii="Times New Roman" w:eastAsia="Franklin Gothic Medium" w:hAnsi="Times New Roman" w:cs="Times New Roman" w:hint="cs"/>
-        <w:b/>
-        <w:bCs/>
-        <w:i/>
-        <w:iCs/>
-        <w:sz w:val="24"/>
-        <w:szCs w:val="24"/>
-        <w:rtl/>
-      </w:rPr>
-      <w:t xml:space="preserve">     </w:t>
-    </w:r>
-    <w:r>
-      <w:rPr>
-        <w:rFonts w:ascii="Times New Roman" w:eastAsia="Franklin Gothic Medium" w:hAnsi="Times New Roman" w:cs="Times New Roman" w:hint="cs"/>
-        <w:b/>
-        <w:bCs/>
-        <w:i/>
-        <w:iCs/>
-        <w:sz w:val="24"/>
-        <w:szCs w:val="24"/>
-        <w:rtl/>
+        <w:b/>
+        <w:bCs/>
+        <w:highlight w:val="red"/>
+        <w:u w:val="single"/>
+        <w:rtl/>
+        <w:lang w:bidi="ar-EG"/>
       </w:rPr>
       <w:t xml:space="preserve">  </w:t>
     </w:r>
     <w:r>
       <w:rPr>
-        <w:rFonts w:ascii="Times New Roman" w:eastAsia="Franklin Gothic Medium" w:hAnsi="Times New Roman" w:cs="Times New Roman"/>
-        <w:b/>
-        <w:bCs/>
-        <w:i/>
-        <w:iCs/>
-        <w:rtl/>
-      </w:rPr>
-      <w:t xml:space="preserve">واتساب </w:t>
-    </w:r>
-    <w:r>
-      <w:rPr>
-        <w:rFonts w:ascii="Times New Roman" w:eastAsia="Franklin Gothic Medium" w:hAnsi="Times New Roman" w:cs="Times New Roman" w:hint="cs"/>
-        <w:b/>
-        <w:bCs/>
-        <w:i/>
-        <w:iCs/>
-        <w:rtl/>
-      </w:rPr>
-      <w:t xml:space="preserve">/ </w:t>
-    </w:r>
-    <w:r>
-      <w:rPr>
-        <w:rFonts w:ascii="Times New Roman" w:eastAsia="Franklin Gothic Medium" w:hAnsi="Times New Roman" w:cs="Times New Roman" w:hint="cs"/>
-        <w:b/>
-        <w:bCs/>
-        <w:i/>
-        <w:iCs/>
+        <w:rFonts w:hint="cs"/>
         <w:highlight w:val="red"/>
-        <w:rtl/>
-      </w:rPr>
-      <w:t>01091708818</w:t>
-    </w:r>
-    <w:r>
-      <w:rPr>
-        <w:rFonts w:ascii="Times New Roman" w:eastAsia="Franklin Gothic Medium" w:hAnsi="Times New Roman" w:cs="Times New Roman" w:hint="cs"/>
-        <w:b/>
-        <w:bCs/>
-        <w:i/>
-        <w:iCs/>
-        <w:rtl/>
-      </w:rPr>
-      <w:t xml:space="preserve">  م / </w:t>
-    </w:r>
-    <w:r>
-      <w:rPr>
-        <w:rFonts w:ascii="Times New Roman" w:eastAsia="Franklin Gothic Medium" w:hAnsi="Times New Roman" w:cs="Times New Roman" w:hint="cs"/>
-        <w:b/>
-        <w:bCs/>
-        <w:i/>
-        <w:iCs/>
-        <w:rtl/>
-      </w:rPr>
-      <w:t xml:space="preserve">   </w:t>
-    </w:r>
-    <w:r>
-      <w:rPr>
-        <w:rFonts w:ascii="Times New Roman" w:eastAsia="Franklin Gothic Medium" w:hAnsi="Times New Roman" w:cs="Times New Roman" w:hint="cs"/>
-        <w:b/>
-        <w:bCs/>
-        <w:i/>
-        <w:iCs/>
-        <w:highlight w:val="red"/>
-        <w:rtl/>
-      </w:rPr>
-      <w:t>01557018818</w:t>
-    </w:r>
-    <w:r>
-      <w:rPr>
-        <w:rFonts w:hint="cs"/>
         <w:rtl/>
         <w:lang w:bidi="ar-EG"/>
       </w:rPr>
@@ -4335,6 +4376,9 @@
     <w:abstractNumId w:val="1"/>
   </w:num>
   <w:num w:numId="2" w16cid:durableId="38675302">
+    <w:abstractNumId w:val="0"/>
+  </w:num>
+  <w:num w:numId="3" w16cid:durableId="296834246">
     <w:abstractNumId w:val="0"/>
   </w:num>
 </w:numbering>

</xml_diff>